<commit_message>
Proyecto listo para fase de pruebas
</commit_message>
<xml_diff>
--- a/backend/templates/SCPM-04.docx
+++ b/backend/templates/SCPM-04.docx
@@ -1,6 +1,6 @@
 
 <file path=word/document.xml><?xml version="1.0" encoding="utf-8"?>
-<w:document xmlns:wpc="http://schemas.microsoft.com/office/word/2010/wordprocessingCanvas" xmlns:cx="http://schemas.microsoft.com/office/drawing/2014/chartex" xmlns:cx1="http://schemas.microsoft.com/office/drawing/2015/9/8/chartex" xmlns:cx2="http://schemas.microsoft.com/office/drawing/2015/10/21/chartex" xmlns:cx3="http://schemas.microsoft.com/office/drawing/2016/5/9/chartex" xmlns:cx4="http://schemas.microsoft.com/office/drawing/2016/5/10/chartex" xmlns:cx5="http://schemas.microsoft.com/office/drawing/2016/5/11/chartex" xmlns:cx6="http://schemas.microsoft.com/office/drawing/2016/5/12/chartex" xmlns:cx7="http://schemas.microsoft.com/office/drawing/2016/5/13/chartex" xmlns:cx8="http://schemas.microsoft.com/office/drawing/2016/5/14/chartex" xmlns:mc="http://schemas.openxmlformats.org/markup-compatibility/2006" xmlns:aink="http://schemas.microsoft.com/office/drawing/2016/ink" xmlns:am3d="http://schemas.microsoft.com/office/drawing/2017/model3d" xmlns:o="urn:schemas-microsoft-com:office:office" xmlns:oel="http://schemas.microsoft.com/office/2019/extlst" xmlns:r="http://schemas.openxmlformats.org/officeDocument/2006/relationships" xmlns:m="http://schemas.openxmlformats.org/officeDocument/2006/math" xmlns:v="urn:schemas-microsoft-com:vml" xmlns:wp14="http://schemas.microsoft.com/office/word/2010/wordprocessingDrawing" xmlns:wp="http://schemas.openxmlformats.org/drawingml/2006/wordprocessingDrawing" xmlns:w10="urn:schemas-microsoft-com:office:word" xmlns:w="http://schemas.openxmlformats.org/wordprocessingml/2006/main" xmlns:w14="http://schemas.microsoft.com/office/word/2010/wordml" xmlns:w15="http://schemas.microsoft.com/office/word/2012/wordml" xmlns:w16cei="http://schemas.microsoft.com/office/word/2026/wordml/cei" xmlns:w16cex="http://schemas.microsoft.com/office/word/2018/wordml/cex" xmlns:w16cid="http://schemas.microsoft.com/office/word/2016/wordml/cid" xmlns:w16="http://schemas.microsoft.com/office/word/2018/wordml" xmlns:w16du="http://schemas.microsoft.com/office/word/2023/wordml/word16du" xmlns:w16sdtdh="http://schemas.microsoft.com/office/word/2020/wordml/sdtdatahash" xmlns:w16sdtfl="http://schemas.microsoft.com/office/word/2024/wordml/sdtformatlock" xmlns:w16se="http://schemas.microsoft.com/office/word/2015/wordml/symex" xmlns:wpg="http://schemas.microsoft.com/office/word/2010/wordprocessingGroup" xmlns:wpi="http://schemas.microsoft.com/office/word/2010/wordprocessingInk" xmlns:wne="http://schemas.microsoft.com/office/word/2006/wordml" xmlns:wps="http://schemas.microsoft.com/office/word/2010/wordprocessingShape" mc:Ignorable="w14 w15 w16se w16cid w16 w16cex w16sdtdh w16sdtfl w16du wp14">
+<w:document xmlns:wpc="http://schemas.microsoft.com/office/word/2010/wordprocessingCanvas" xmlns:cx="http://schemas.microsoft.com/office/drawing/2014/chartex" xmlns:cx1="http://schemas.microsoft.com/office/drawing/2015/9/8/chartex" xmlns:cx2="http://schemas.microsoft.com/office/drawing/2015/10/21/chartex" xmlns:cx3="http://schemas.microsoft.com/office/drawing/2016/5/9/chartex" xmlns:cx4="http://schemas.microsoft.com/office/drawing/2016/5/10/chartex" xmlns:cx5="http://schemas.microsoft.com/office/drawing/2016/5/11/chartex" xmlns:cx6="http://schemas.microsoft.com/office/drawing/2016/5/12/chartex" xmlns:cx7="http://schemas.microsoft.com/office/drawing/2016/5/13/chartex" xmlns:cx8="http://schemas.microsoft.com/office/drawing/2016/5/14/chartex" xmlns:mc="http://schemas.openxmlformats.org/markup-compatibility/2006" xmlns:aink="http://schemas.microsoft.com/office/drawing/2016/ink" xmlns:am3d="http://schemas.microsoft.com/office/drawing/2017/model3d" xmlns:o="urn:schemas-microsoft-com:office:office" xmlns:oel="http://schemas.microsoft.com/office/2019/extlst" xmlns:r="http://schemas.openxmlformats.org/officeDocument/2006/relationships" xmlns:m="http://schemas.openxmlformats.org/officeDocument/2006/math" xmlns:v="urn:schemas-microsoft-com:vml" xmlns:wp14="http://schemas.microsoft.com/office/word/2010/wordprocessingDrawing" xmlns:wp="http://schemas.openxmlformats.org/drawingml/2006/wordprocessingDrawing" xmlns:w10="urn:schemas-microsoft-com:office:word" xmlns:w="http://schemas.openxmlformats.org/wordprocessingml/2006/main" xmlns:w14="http://schemas.microsoft.com/office/word/2010/wordml" xmlns:w15="http://schemas.microsoft.com/office/word/2012/wordml" xmlns:w16cex="http://schemas.microsoft.com/office/word/2018/wordml/cex" xmlns:w16cid="http://schemas.microsoft.com/office/word/2016/wordml/cid" xmlns:w16="http://schemas.microsoft.com/office/word/2018/wordml" xmlns:w16du="http://schemas.microsoft.com/office/word/2023/wordml/word16du" xmlns:w16sdtdh="http://schemas.microsoft.com/office/word/2020/wordml/sdtdatahash" xmlns:w16sdtfl="http://schemas.microsoft.com/office/word/2024/wordml/sdtformatlock" xmlns:w16se="http://schemas.microsoft.com/office/word/2015/wordml/symex" xmlns:wpg="http://schemas.microsoft.com/office/word/2010/wordprocessingGroup" xmlns:wpi="http://schemas.microsoft.com/office/word/2010/wordprocessingInk" xmlns:wne="http://schemas.microsoft.com/office/word/2006/wordml" xmlns:wps="http://schemas.microsoft.com/office/word/2010/wordprocessingShape" mc:Ignorable="w14 w15 w16se w16cid w16 w16cex w16sdtdh w16sdtfl w16du wp14">
   <w:body>
     <w:p>
       <w:pPr>
@@ -135,7 +135,43 @@
                 <w:szCs w:val="20"/>
                 <w:lang w:val="es-ES"/>
               </w:rPr>
-              <w:t>{{clave_evento}}</w:t>
+              <w:t>{{</w:t>
+            </w:r>
+            <w:r>
+              <w:rPr>
+                <w:rFonts w:cs="Arial"/>
+                <w:sz w:val="20"/>
+                <w:szCs w:val="20"/>
+                <w:lang w:val="es-ES"/>
+              </w:rPr>
+              <w:t xml:space="preserve"> </w:t>
+            </w:r>
+            <w:r>
+              <w:rPr>
+                <w:rFonts w:cs="Arial"/>
+                <w:sz w:val="20"/>
+                <w:szCs w:val="20"/>
+                <w:lang w:val="es-ES"/>
+              </w:rPr>
+              <w:t>clave_evento</w:t>
+            </w:r>
+            <w:r>
+              <w:rPr>
+                <w:rFonts w:cs="Arial"/>
+                <w:sz w:val="20"/>
+                <w:szCs w:val="20"/>
+                <w:lang w:val="es-ES"/>
+              </w:rPr>
+              <w:t xml:space="preserve"> </w:t>
+            </w:r>
+            <w:r>
+              <w:rPr>
+                <w:rFonts w:cs="Arial"/>
+                <w:sz w:val="20"/>
+                <w:szCs w:val="20"/>
+                <w:lang w:val="es-ES"/>
+              </w:rPr>
+              <w:t>}}</w:t>
             </w:r>
           </w:p>
         </w:tc>
@@ -216,7 +252,43 @@
                 <w:sz w:val="20"/>
                 <w:szCs w:val="20"/>
               </w:rPr>
-              <w:t>{{nombre_evento}}</w:t>
+              <w:t>{{</w:t>
+            </w:r>
+            <w:r>
+              <w:rPr>
+                <w:rFonts w:cs="Arial"/>
+                <w:noProof/>
+                <w:sz w:val="20"/>
+                <w:szCs w:val="20"/>
+              </w:rPr>
+              <w:t xml:space="preserve"> </w:t>
+            </w:r>
+            <w:r>
+              <w:rPr>
+                <w:rFonts w:cs="Arial"/>
+                <w:noProof/>
+                <w:sz w:val="20"/>
+                <w:szCs w:val="20"/>
+              </w:rPr>
+              <w:t>nombre_evento</w:t>
+            </w:r>
+            <w:r>
+              <w:rPr>
+                <w:rFonts w:cs="Arial"/>
+                <w:noProof/>
+                <w:sz w:val="20"/>
+                <w:szCs w:val="20"/>
+              </w:rPr>
+              <w:t xml:space="preserve"> </w:t>
+            </w:r>
+            <w:r>
+              <w:rPr>
+                <w:rFonts w:cs="Arial"/>
+                <w:noProof/>
+                <w:sz w:val="20"/>
+                <w:szCs w:val="20"/>
+              </w:rPr>
+              <w:t>}}</w:t>
             </w:r>
             <w:r>
               <w:rPr>
@@ -280,7 +352,43 @@
                 <w:szCs w:val="20"/>
                 <w:lang w:val="es-ES"/>
               </w:rPr>
-              <w:t>{{ficha}}</w:t>
+              <w:t>{{</w:t>
+            </w:r>
+            <w:r>
+              <w:rPr>
+                <w:rFonts w:cs="Arial"/>
+                <w:sz w:val="20"/>
+                <w:szCs w:val="20"/>
+                <w:lang w:val="es-ES"/>
+              </w:rPr>
+              <w:t xml:space="preserve"> </w:t>
+            </w:r>
+            <w:r>
+              <w:rPr>
+                <w:rFonts w:cs="Arial"/>
+                <w:sz w:val="20"/>
+                <w:szCs w:val="20"/>
+                <w:lang w:val="es-ES"/>
+              </w:rPr>
+              <w:t>ficha</w:t>
+            </w:r>
+            <w:r>
+              <w:rPr>
+                <w:rFonts w:cs="Arial"/>
+                <w:sz w:val="20"/>
+                <w:szCs w:val="20"/>
+                <w:lang w:val="es-ES"/>
+              </w:rPr>
+              <w:t xml:space="preserve"> </w:t>
+            </w:r>
+            <w:r>
+              <w:rPr>
+                <w:rFonts w:cs="Arial"/>
+                <w:sz w:val="20"/>
+                <w:szCs w:val="20"/>
+                <w:lang w:val="es-ES"/>
+              </w:rPr>
+              <w:t>}}</w:t>
             </w:r>
           </w:p>
         </w:tc>
@@ -3336,7 +3444,7 @@
                     </wp:anchor>
                   </w:drawing>
                 </mc:Choice>
-                <mc:Fallback>
+                <mc:Fallback xmlns:w16cei="http://schemas.microsoft.com/office/word/2026/wordml/cei">
                   <w:pict>
                     <v:shape w14:anchorId="5E158D54" id="Signo de multiplicación 2" o:spid="_x0000_s1026" style="position:absolute;margin-left:-1.6pt;margin-top:-4.5pt;width:24pt;height:23.55pt;z-index:251664384;visibility:visible;mso-wrap-style:square;mso-width-percent:0;mso-height-percent:0;mso-wrap-distance-left:9pt;mso-wrap-distance-top:0;mso-wrap-distance-right:9pt;mso-wrap-distance-bottom:0;mso-position-horizontal:absolute;mso-position-horizontal-relative:text;mso-position-vertical:absolute;mso-position-vertical-relative:text;mso-width-percent:0;mso-height-percent:0;mso-width-relative:margin;mso-height-relative:margin;v-text-anchor:middle" coordsize="304800,299085" o:gfxdata="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" path="m48571,96938l97840,46728r54560,53537l206960,46728r49269,50210l202619,149543r53610,52604l206960,252357,152400,198820,97840,252357,48571,202147r53610,-52604l48571,96938xe" fillcolor="#4f81bd [3204]" strokecolor="#0a121c [484]" strokeweight="2pt">
                       <v:path arrowok="t" o:connecttype="custom" o:connectlocs="48571,96938;97840,46728;152400,100265;206960,46728;256229,96938;202619,149543;256229,202147;206960,252357;152400,198820;97840,252357;48571,202147;102181,149543;48571,96938" o:connectangles="0,0,0,0,0,0,0,0,0,0,0,0,0"/>
@@ -3658,7 +3766,7 @@
                     </wp:anchor>
                   </w:drawing>
                 </mc:Choice>
-                <mc:Fallback>
+                <mc:Fallback xmlns:w16cei="http://schemas.microsoft.com/office/word/2026/wordml/cei">
                   <w:pict>
                     <v:shape w14:anchorId="3C04CFCB" id="Signo de multiplicación 2" o:spid="_x0000_s1026" style="position:absolute;margin-left:-1.85pt;margin-top:-4.35pt;width:24pt;height:23.55pt;z-index:251662336;visibility:visible;mso-wrap-style:square;mso-width-percent:0;mso-height-percent:0;mso-wrap-distance-left:9pt;mso-wrap-distance-top:0;mso-wrap-distance-right:9pt;mso-wrap-distance-bottom:0;mso-position-horizontal:absolute;mso-position-horizontal-relative:text;mso-position-vertical:absolute;mso-position-vertical-relative:text;mso-width-percent:0;mso-height-percent:0;mso-width-relative:margin;mso-height-relative:margin;v-text-anchor:middle" coordsize="304800,299085" o:gfxdata="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" path="m48571,96938l97840,46728r54560,53537l206960,46728r49269,50210l202619,149543r53610,52604l206960,252357,152400,198820,97840,252357,48571,202147r53610,-52604l48571,96938xe" fillcolor="#4f81bd [3204]" strokecolor="#0a121c [484]" strokeweight="2pt">
                       <v:path arrowok="t" o:connecttype="custom" o:connectlocs="48571,96938;97840,46728;152400,100265;206960,46728;256229,96938;202619,149543;256229,202147;206960,252357;152400,198820;97840,252357;48571,202147;102181,149543;48571,96938" o:connectangles="0,0,0,0,0,0,0,0,0,0,0,0,0"/>
@@ -6284,8 +6392,8 @@
         <w:tblLook w:val="04A0" w:firstRow="1" w:lastRow="0" w:firstColumn="1" w:lastColumn="0" w:noHBand="0" w:noVBand="1"/>
       </w:tblPr>
       <w:tblGrid>
-        <w:gridCol w:w="7727"/>
-        <w:gridCol w:w="2634"/>
+        <w:gridCol w:w="7723"/>
+        <w:gridCol w:w="2638"/>
       </w:tblGrid>
       <w:tr>
         <w:trPr>
@@ -6338,15 +6446,6 @@
                 <w:szCs w:val="18"/>
                 <w:lang w:val="es-ES"/>
               </w:rPr>
-              <w:t xml:space="preserve"> </w:t>
-            </w:r>
-            <w:r>
-              <w:rPr>
-                <w:rFonts w:cs="Arial"/>
-                <w:sz w:val="18"/>
-                <w:szCs w:val="18"/>
-                <w:lang w:val="es-ES"/>
-              </w:rPr>
               <w:fldChar w:fldCharType="begin"/>
             </w:r>
             <w:r>
@@ -6375,7 +6474,7 @@
                 <w:szCs w:val="18"/>
                 <w:lang w:val="es-ES"/>
               </w:rPr>
-              <w:t>ING. VICTOR MANUEL PRIEGO ADRIANO</w:t>
+              <w:t xml:space="preserve">ING. </w:t>
             </w:r>
             <w:r>
               <w:rPr>
@@ -6386,6 +6485,15 @@
               </w:rPr>
               <w:fldChar w:fldCharType="end"/>
             </w:r>
+            <w:r>
+              <w:rPr>
+                <w:rFonts w:cs="Arial"/>
+                <w:sz w:val="18"/>
+                <w:szCs w:val="18"/>
+                <w:lang w:val="es-ES"/>
+              </w:rPr>
+              <w:t>{{ nombre_supervisor }}</w:t>
+            </w:r>
           </w:p>
         </w:tc>
         <w:tc>
@@ -6417,53 +6525,7 @@
                 <w:szCs w:val="18"/>
                 <w:lang w:val="es-ES"/>
               </w:rPr>
-              <w:t xml:space="preserve"> </w:t>
-            </w:r>
-            <w:r>
-              <w:rPr>
-                <w:rFonts w:cs="Arial"/>
-                <w:sz w:val="18"/>
-                <w:szCs w:val="18"/>
-                <w:lang w:val="es-ES"/>
-              </w:rPr>
-              <w:fldChar w:fldCharType="begin"/>
-            </w:r>
-            <w:r>
-              <w:rPr>
-                <w:rFonts w:cs="Arial"/>
-                <w:sz w:val="18"/>
-                <w:szCs w:val="18"/>
-                <w:lang w:val="es-ES"/>
-              </w:rPr>
-              <w:instrText xml:space="preserve"> MERGEFIELD FICHA_ST </w:instrText>
-            </w:r>
-            <w:r>
-              <w:rPr>
-                <w:rFonts w:cs="Arial"/>
-                <w:sz w:val="18"/>
-                <w:szCs w:val="18"/>
-                <w:lang w:val="es-ES"/>
-              </w:rPr>
-              <w:fldChar w:fldCharType="separate"/>
-            </w:r>
-            <w:r>
-              <w:rPr>
-                <w:rFonts w:cs="Arial"/>
-                <w:noProof/>
-                <w:sz w:val="18"/>
-                <w:szCs w:val="18"/>
-                <w:lang w:val="es-ES"/>
-              </w:rPr>
-              <w:t>376934</w:t>
-            </w:r>
-            <w:r>
-              <w:rPr>
-                <w:rFonts w:cs="Arial"/>
-                <w:sz w:val="18"/>
-                <w:szCs w:val="18"/>
-                <w:lang w:val="es-ES"/>
-              </w:rPr>
-              <w:fldChar w:fldCharType="end"/>
+              <w:t xml:space="preserve"> {{ ficha_supervisor }}</w:t>
             </w:r>
           </w:p>
         </w:tc>
@@ -7230,7 +7292,7 @@
               </wp:anchor>
             </w:drawing>
           </mc:Choice>
-          <mc:Fallback>
+          <mc:Fallback xmlns:w16cei="http://schemas.microsoft.com/office/word/2026/wordml/cei">
             <w:pict>
               <v:line w14:anchorId="5D60DBAD" id="2 Conector recto" o:spid="_x0000_s1026" style="position:absolute;flip:y;z-index:251659264;visibility:visible;mso-wrap-style:square;mso-width-percent:0;mso-height-percent:0;mso-wrap-distance-left:9pt;mso-wrap-distance-top:0;mso-wrap-distance-right:9pt;mso-wrap-distance-bottom:0;mso-position-horizontal:absolute;mso-position-horizontal-relative:text;mso-position-vertical:absolute;mso-position-vertical-relative:text;mso-width-percent:0;mso-height-percent:0;mso-width-relative:margin;mso-height-relative:margin" from="172.05pt,13.25pt" to="391.45pt,13.25pt" o:gfxdata="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" strokecolor="black [3213]"/>
             </w:pict>
@@ -7284,7 +7346,7 @@
           <w:szCs w:val="18"/>
           <w:lang w:val="pt-PT"/>
         </w:rPr>
-        <w:t>ING. VICTOR MANUEL PRIEGO ADRIANO</w:t>
+        <w:t xml:space="preserve">ING. </w:t>
       </w:r>
       <w:r>
         <w:rPr>
@@ -7294,6 +7356,15 @@
           <w:szCs w:val="18"/>
         </w:rPr>
         <w:fldChar w:fldCharType="end"/>
+      </w:r>
+      <w:r>
+        <w:rPr>
+          <w:rFonts w:cs="Arial"/>
+          <w:bCs w:val="0"/>
+          <w:sz w:val="18"/>
+          <w:szCs w:val="18"/>
+        </w:rPr>
+        <w:t>{{ nombre_supervisor }}</w:t>
       </w:r>
       <w:r>
         <w:rPr>
@@ -7321,47 +7392,9 @@
           <w:bCs w:val="0"/>
           <w:sz w:val="18"/>
           <w:szCs w:val="18"/>
-        </w:rPr>
-        <w:fldChar w:fldCharType="begin"/>
-      </w:r>
-      <w:r>
-        <w:rPr>
-          <w:rFonts w:cs="Arial"/>
-          <w:bCs w:val="0"/>
-          <w:sz w:val="18"/>
-          <w:szCs w:val="18"/>
           <w:lang w:val="pt-PT"/>
         </w:rPr>
-        <w:instrText xml:space="preserve"> MERGEFIELD FICHA_ST </w:instrText>
-      </w:r>
-      <w:r>
-        <w:rPr>
-          <w:rFonts w:cs="Arial"/>
-          <w:bCs w:val="0"/>
-          <w:sz w:val="18"/>
-          <w:szCs w:val="18"/>
-        </w:rPr>
-        <w:fldChar w:fldCharType="separate"/>
-      </w:r>
-      <w:r>
-        <w:rPr>
-          <w:rFonts w:cs="Arial"/>
-          <w:bCs w:val="0"/>
-          <w:noProof/>
-          <w:sz w:val="18"/>
-          <w:szCs w:val="18"/>
-          <w:lang w:val="pt-PT"/>
-        </w:rPr>
-        <w:t>376934</w:t>
-      </w:r>
-      <w:r>
-        <w:rPr>
-          <w:rFonts w:cs="Arial"/>
-          <w:bCs w:val="0"/>
-          <w:sz w:val="18"/>
-          <w:szCs w:val="18"/>
-        </w:rPr>
-        <w:fldChar w:fldCharType="end"/>
+        <w:t xml:space="preserve"> {{ ficha_supervisor }}</w:t>
       </w:r>
     </w:p>
     <w:p>
@@ -7463,7 +7496,7 @@
 </file>
 
 <file path=word/endnotes.xml><?xml version="1.0" encoding="utf-8"?>
-<w:endnotes xmlns:wpc="http://schemas.microsoft.com/office/word/2010/wordprocessingCanvas" xmlns:cx="http://schemas.microsoft.com/office/drawing/2014/chartex" xmlns:cx1="http://schemas.microsoft.com/office/drawing/2015/9/8/chartex" xmlns:cx2="http://schemas.microsoft.com/office/drawing/2015/10/21/chartex" xmlns:cx3="http://schemas.microsoft.com/office/drawing/2016/5/9/chartex" xmlns:cx4="http://schemas.microsoft.com/office/drawing/2016/5/10/chartex" xmlns:cx5="http://schemas.microsoft.com/office/drawing/2016/5/11/chartex" xmlns:cx6="http://schemas.microsoft.com/office/drawing/2016/5/12/chartex" xmlns:cx7="http://schemas.microsoft.com/office/drawing/2016/5/13/chartex" xmlns:cx8="http://schemas.microsoft.com/office/drawing/2016/5/14/chartex" xmlns:mc="http://schemas.openxmlformats.org/markup-compatibility/2006" xmlns:aink="http://schemas.microsoft.com/office/drawing/2016/ink" xmlns:am3d="http://schemas.microsoft.com/office/drawing/2017/model3d" xmlns:o="urn:schemas-microsoft-com:office:office" xmlns:oel="http://schemas.microsoft.com/office/2019/extlst" xmlns:r="http://schemas.openxmlformats.org/officeDocument/2006/relationships" xmlns:m="http://schemas.openxmlformats.org/officeDocument/2006/math" xmlns:v="urn:schemas-microsoft-com:vml" xmlns:wp14="http://schemas.microsoft.com/office/word/2010/wordprocessingDrawing" xmlns:wp="http://schemas.openxmlformats.org/drawingml/2006/wordprocessingDrawing" xmlns:w10="urn:schemas-microsoft-com:office:word" xmlns:w="http://schemas.openxmlformats.org/wordprocessingml/2006/main" xmlns:w14="http://schemas.microsoft.com/office/word/2010/wordml" xmlns:w15="http://schemas.microsoft.com/office/word/2012/wordml" xmlns:w16cei="http://schemas.microsoft.com/office/word/2026/wordml/cei" xmlns:w16cex="http://schemas.microsoft.com/office/word/2018/wordml/cex" xmlns:w16cid="http://schemas.microsoft.com/office/word/2016/wordml/cid" xmlns:w16="http://schemas.microsoft.com/office/word/2018/wordml" xmlns:w16du="http://schemas.microsoft.com/office/word/2023/wordml/word16du" xmlns:w16sdtdh="http://schemas.microsoft.com/office/word/2020/wordml/sdtdatahash" xmlns:w16sdtfl="http://schemas.microsoft.com/office/word/2024/wordml/sdtformatlock" xmlns:w16se="http://schemas.microsoft.com/office/word/2015/wordml/symex" xmlns:wpg="http://schemas.microsoft.com/office/word/2010/wordprocessingGroup" xmlns:wpi="http://schemas.microsoft.com/office/word/2010/wordprocessingInk" xmlns:wne="http://schemas.microsoft.com/office/word/2006/wordml" xmlns:wps="http://schemas.microsoft.com/office/word/2010/wordprocessingShape" mc:Ignorable="w14 w15 w16se w16cid w16 w16cex w16sdtdh w16sdtfl w16du wp14">
+<w:endnotes xmlns:wpc="http://schemas.microsoft.com/office/word/2010/wordprocessingCanvas" xmlns:cx="http://schemas.microsoft.com/office/drawing/2014/chartex" xmlns:cx1="http://schemas.microsoft.com/office/drawing/2015/9/8/chartex" xmlns:cx2="http://schemas.microsoft.com/office/drawing/2015/10/21/chartex" xmlns:cx3="http://schemas.microsoft.com/office/drawing/2016/5/9/chartex" xmlns:cx4="http://schemas.microsoft.com/office/drawing/2016/5/10/chartex" xmlns:cx5="http://schemas.microsoft.com/office/drawing/2016/5/11/chartex" xmlns:cx6="http://schemas.microsoft.com/office/drawing/2016/5/12/chartex" xmlns:cx7="http://schemas.microsoft.com/office/drawing/2016/5/13/chartex" xmlns:cx8="http://schemas.microsoft.com/office/drawing/2016/5/14/chartex" xmlns:mc="http://schemas.openxmlformats.org/markup-compatibility/2006" xmlns:aink="http://schemas.microsoft.com/office/drawing/2016/ink" xmlns:am3d="http://schemas.microsoft.com/office/drawing/2017/model3d" xmlns:o="urn:schemas-microsoft-com:office:office" xmlns:oel="http://schemas.microsoft.com/office/2019/extlst" xmlns:r="http://schemas.openxmlformats.org/officeDocument/2006/relationships" xmlns:m="http://schemas.openxmlformats.org/officeDocument/2006/math" xmlns:v="urn:schemas-microsoft-com:vml" xmlns:wp14="http://schemas.microsoft.com/office/word/2010/wordprocessingDrawing" xmlns:wp="http://schemas.openxmlformats.org/drawingml/2006/wordprocessingDrawing" xmlns:w10="urn:schemas-microsoft-com:office:word" xmlns:w="http://schemas.openxmlformats.org/wordprocessingml/2006/main" xmlns:w14="http://schemas.microsoft.com/office/word/2010/wordml" xmlns:w15="http://schemas.microsoft.com/office/word/2012/wordml" xmlns:w16cex="http://schemas.microsoft.com/office/word/2018/wordml/cex" xmlns:w16cid="http://schemas.microsoft.com/office/word/2016/wordml/cid" xmlns:w16="http://schemas.microsoft.com/office/word/2018/wordml" xmlns:w16du="http://schemas.microsoft.com/office/word/2023/wordml/word16du" xmlns:w16sdtdh="http://schemas.microsoft.com/office/word/2020/wordml/sdtdatahash" xmlns:w16sdtfl="http://schemas.microsoft.com/office/word/2024/wordml/sdtformatlock" xmlns:w16se="http://schemas.microsoft.com/office/word/2015/wordml/symex" xmlns:wpg="http://schemas.microsoft.com/office/word/2010/wordprocessingGroup" xmlns:wpi="http://schemas.microsoft.com/office/word/2010/wordprocessingInk" xmlns:wne="http://schemas.microsoft.com/office/word/2006/wordml" xmlns:wps="http://schemas.microsoft.com/office/word/2010/wordprocessingShape" mc:Ignorable="w14 w15 w16se w16cid w16 w16cex w16sdtdh w16sdtfl w16du wp14">
   <w:endnote w:type="separator" w:id="-1">
     <w:p>
       <w:r>
@@ -7482,7 +7515,7 @@
 </file>
 
 <file path=word/footnotes.xml><?xml version="1.0" encoding="utf-8"?>
-<w:footnotes xmlns:wpc="http://schemas.microsoft.com/office/word/2010/wordprocessingCanvas" xmlns:cx="http://schemas.microsoft.com/office/drawing/2014/chartex" xmlns:cx1="http://schemas.microsoft.com/office/drawing/2015/9/8/chartex" xmlns:cx2="http://schemas.microsoft.com/office/drawing/2015/10/21/chartex" xmlns:cx3="http://schemas.microsoft.com/office/drawing/2016/5/9/chartex" xmlns:cx4="http://schemas.microsoft.com/office/drawing/2016/5/10/chartex" xmlns:cx5="http://schemas.microsoft.com/office/drawing/2016/5/11/chartex" xmlns:cx6="http://schemas.microsoft.com/office/drawing/2016/5/12/chartex" xmlns:cx7="http://schemas.microsoft.com/office/drawing/2016/5/13/chartex" xmlns:cx8="http://schemas.microsoft.com/office/drawing/2016/5/14/chartex" xmlns:mc="http://schemas.openxmlformats.org/markup-compatibility/2006" xmlns:aink="http://schemas.microsoft.com/office/drawing/2016/ink" xmlns:am3d="http://schemas.microsoft.com/office/drawing/2017/model3d" xmlns:o="urn:schemas-microsoft-com:office:office" xmlns:oel="http://schemas.microsoft.com/office/2019/extlst" xmlns:r="http://schemas.openxmlformats.org/officeDocument/2006/relationships" xmlns:m="http://schemas.openxmlformats.org/officeDocument/2006/math" xmlns:v="urn:schemas-microsoft-com:vml" xmlns:wp14="http://schemas.microsoft.com/office/word/2010/wordprocessingDrawing" xmlns:wp="http://schemas.openxmlformats.org/drawingml/2006/wordprocessingDrawing" xmlns:w10="urn:schemas-microsoft-com:office:word" xmlns:w="http://schemas.openxmlformats.org/wordprocessingml/2006/main" xmlns:w14="http://schemas.microsoft.com/office/word/2010/wordml" xmlns:w15="http://schemas.microsoft.com/office/word/2012/wordml" xmlns:w16cei="http://schemas.microsoft.com/office/word/2026/wordml/cei" xmlns:w16cex="http://schemas.microsoft.com/office/word/2018/wordml/cex" xmlns:w16cid="http://schemas.microsoft.com/office/word/2016/wordml/cid" xmlns:w16="http://schemas.microsoft.com/office/word/2018/wordml" xmlns:w16du="http://schemas.microsoft.com/office/word/2023/wordml/word16du" xmlns:w16sdtdh="http://schemas.microsoft.com/office/word/2020/wordml/sdtdatahash" xmlns:w16sdtfl="http://schemas.microsoft.com/office/word/2024/wordml/sdtformatlock" xmlns:w16se="http://schemas.microsoft.com/office/word/2015/wordml/symex" xmlns:wpg="http://schemas.microsoft.com/office/word/2010/wordprocessingGroup" xmlns:wpi="http://schemas.microsoft.com/office/word/2010/wordprocessingInk" xmlns:wne="http://schemas.microsoft.com/office/word/2006/wordml" xmlns:wps="http://schemas.microsoft.com/office/word/2010/wordprocessingShape" mc:Ignorable="w14 w15 w16se w16cid w16 w16cex w16sdtdh w16sdtfl w16du wp14">
+<w:footnotes xmlns:wpc="http://schemas.microsoft.com/office/word/2010/wordprocessingCanvas" xmlns:cx="http://schemas.microsoft.com/office/drawing/2014/chartex" xmlns:cx1="http://schemas.microsoft.com/office/drawing/2015/9/8/chartex" xmlns:cx2="http://schemas.microsoft.com/office/drawing/2015/10/21/chartex" xmlns:cx3="http://schemas.microsoft.com/office/drawing/2016/5/9/chartex" xmlns:cx4="http://schemas.microsoft.com/office/drawing/2016/5/10/chartex" xmlns:cx5="http://schemas.microsoft.com/office/drawing/2016/5/11/chartex" xmlns:cx6="http://schemas.microsoft.com/office/drawing/2016/5/12/chartex" xmlns:cx7="http://schemas.microsoft.com/office/drawing/2016/5/13/chartex" xmlns:cx8="http://schemas.microsoft.com/office/drawing/2016/5/14/chartex" xmlns:mc="http://schemas.openxmlformats.org/markup-compatibility/2006" xmlns:aink="http://schemas.microsoft.com/office/drawing/2016/ink" xmlns:am3d="http://schemas.microsoft.com/office/drawing/2017/model3d" xmlns:o="urn:schemas-microsoft-com:office:office" xmlns:oel="http://schemas.microsoft.com/office/2019/extlst" xmlns:r="http://schemas.openxmlformats.org/officeDocument/2006/relationships" xmlns:m="http://schemas.openxmlformats.org/officeDocument/2006/math" xmlns:v="urn:schemas-microsoft-com:vml" xmlns:wp14="http://schemas.microsoft.com/office/word/2010/wordprocessingDrawing" xmlns:wp="http://schemas.openxmlformats.org/drawingml/2006/wordprocessingDrawing" xmlns:w10="urn:schemas-microsoft-com:office:word" xmlns:w="http://schemas.openxmlformats.org/wordprocessingml/2006/main" xmlns:w14="http://schemas.microsoft.com/office/word/2010/wordml" xmlns:w15="http://schemas.microsoft.com/office/word/2012/wordml" xmlns:w16cex="http://schemas.microsoft.com/office/word/2018/wordml/cex" xmlns:w16cid="http://schemas.microsoft.com/office/word/2016/wordml/cid" xmlns:w16="http://schemas.microsoft.com/office/word/2018/wordml" xmlns:w16du="http://schemas.microsoft.com/office/word/2023/wordml/word16du" xmlns:w16sdtdh="http://schemas.microsoft.com/office/word/2020/wordml/sdtdatahash" xmlns:w16sdtfl="http://schemas.microsoft.com/office/word/2024/wordml/sdtformatlock" xmlns:w16se="http://schemas.microsoft.com/office/word/2015/wordml/symex" xmlns:wpg="http://schemas.microsoft.com/office/word/2010/wordprocessingGroup" xmlns:wpi="http://schemas.microsoft.com/office/word/2010/wordprocessingInk" xmlns:wne="http://schemas.microsoft.com/office/word/2006/wordml" xmlns:wps="http://schemas.microsoft.com/office/word/2010/wordprocessingShape" mc:Ignorable="w14 w15 w16se w16cid w16 w16cex w16sdtdh w16sdtfl w16du wp14">
   <w:footnote w:type="separator" w:id="-1">
     <w:p>
       <w:r>
@@ -7501,7 +7534,7 @@
 </file>
 
 <file path=word/header1.xml><?xml version="1.0" encoding="utf-8"?>
-<w:hdr xmlns:wpc="http://schemas.microsoft.com/office/word/2010/wordprocessingCanvas" xmlns:cx="http://schemas.microsoft.com/office/drawing/2014/chartex" xmlns:cx1="http://schemas.microsoft.com/office/drawing/2015/9/8/chartex" xmlns:cx2="http://schemas.microsoft.com/office/drawing/2015/10/21/chartex" xmlns:cx3="http://schemas.microsoft.com/office/drawing/2016/5/9/chartex" xmlns:cx4="http://schemas.microsoft.com/office/drawing/2016/5/10/chartex" xmlns:cx5="http://schemas.microsoft.com/office/drawing/2016/5/11/chartex" xmlns:cx6="http://schemas.microsoft.com/office/drawing/2016/5/12/chartex" xmlns:cx7="http://schemas.microsoft.com/office/drawing/2016/5/13/chartex" xmlns:cx8="http://schemas.microsoft.com/office/drawing/2016/5/14/chartex" xmlns:mc="http://schemas.openxmlformats.org/markup-compatibility/2006" xmlns:aink="http://schemas.microsoft.com/office/drawing/2016/ink" xmlns:am3d="http://schemas.microsoft.com/office/drawing/2017/model3d" xmlns:o="urn:schemas-microsoft-com:office:office" xmlns:oel="http://schemas.microsoft.com/office/2019/extlst" xmlns:r="http://schemas.openxmlformats.org/officeDocument/2006/relationships" xmlns:m="http://schemas.openxmlformats.org/officeDocument/2006/math" xmlns:v="urn:schemas-microsoft-com:vml" xmlns:wp14="http://schemas.microsoft.com/office/word/2010/wordprocessingDrawing" xmlns:wp="http://schemas.openxmlformats.org/drawingml/2006/wordprocessingDrawing" xmlns:w10="urn:schemas-microsoft-com:office:word" xmlns:w="http://schemas.openxmlformats.org/wordprocessingml/2006/main" xmlns:w14="http://schemas.microsoft.com/office/word/2010/wordml" xmlns:w15="http://schemas.microsoft.com/office/word/2012/wordml" xmlns:w16cei="http://schemas.microsoft.com/office/word/2026/wordml/cei" xmlns:w16cex="http://schemas.microsoft.com/office/word/2018/wordml/cex" xmlns:w16cid="http://schemas.microsoft.com/office/word/2016/wordml/cid" xmlns:w16="http://schemas.microsoft.com/office/word/2018/wordml" xmlns:w16du="http://schemas.microsoft.com/office/word/2023/wordml/word16du" xmlns:w16sdtdh="http://schemas.microsoft.com/office/word/2020/wordml/sdtdatahash" xmlns:w16sdtfl="http://schemas.microsoft.com/office/word/2024/wordml/sdtformatlock" xmlns:w16se="http://schemas.microsoft.com/office/word/2015/wordml/symex" xmlns:wpg="http://schemas.microsoft.com/office/word/2010/wordprocessingGroup" xmlns:wpi="http://schemas.microsoft.com/office/word/2010/wordprocessingInk" xmlns:wne="http://schemas.microsoft.com/office/word/2006/wordml" xmlns:wps="http://schemas.microsoft.com/office/word/2010/wordprocessingShape" mc:Ignorable="w14 w15 w16se w16cid w16 w16cex w16sdtdh w16sdtfl w16du wp14">
+<w:hdr xmlns:wpc="http://schemas.microsoft.com/office/word/2010/wordprocessingCanvas" xmlns:cx="http://schemas.microsoft.com/office/drawing/2014/chartex" xmlns:cx1="http://schemas.microsoft.com/office/drawing/2015/9/8/chartex" xmlns:cx2="http://schemas.microsoft.com/office/drawing/2015/10/21/chartex" xmlns:cx3="http://schemas.microsoft.com/office/drawing/2016/5/9/chartex" xmlns:cx4="http://schemas.microsoft.com/office/drawing/2016/5/10/chartex" xmlns:cx5="http://schemas.microsoft.com/office/drawing/2016/5/11/chartex" xmlns:cx6="http://schemas.microsoft.com/office/drawing/2016/5/12/chartex" xmlns:cx7="http://schemas.microsoft.com/office/drawing/2016/5/13/chartex" xmlns:cx8="http://schemas.microsoft.com/office/drawing/2016/5/14/chartex" xmlns:mc="http://schemas.openxmlformats.org/markup-compatibility/2006" xmlns:aink="http://schemas.microsoft.com/office/drawing/2016/ink" xmlns:am3d="http://schemas.microsoft.com/office/drawing/2017/model3d" xmlns:o="urn:schemas-microsoft-com:office:office" xmlns:oel="http://schemas.microsoft.com/office/2019/extlst" xmlns:r="http://schemas.openxmlformats.org/officeDocument/2006/relationships" xmlns:m="http://schemas.openxmlformats.org/officeDocument/2006/math" xmlns:v="urn:schemas-microsoft-com:vml" xmlns:wp14="http://schemas.microsoft.com/office/word/2010/wordprocessingDrawing" xmlns:wp="http://schemas.openxmlformats.org/drawingml/2006/wordprocessingDrawing" xmlns:w10="urn:schemas-microsoft-com:office:word" xmlns:w="http://schemas.openxmlformats.org/wordprocessingml/2006/main" xmlns:w14="http://schemas.microsoft.com/office/word/2010/wordml" xmlns:w15="http://schemas.microsoft.com/office/word/2012/wordml" xmlns:w16cex="http://schemas.microsoft.com/office/word/2018/wordml/cex" xmlns:w16cid="http://schemas.microsoft.com/office/word/2016/wordml/cid" xmlns:w16="http://schemas.microsoft.com/office/word/2018/wordml" xmlns:w16du="http://schemas.microsoft.com/office/word/2023/wordml/word16du" xmlns:w16sdtdh="http://schemas.microsoft.com/office/word/2020/wordml/sdtdatahash" xmlns:w16sdtfl="http://schemas.microsoft.com/office/word/2024/wordml/sdtformatlock" xmlns:w16se="http://schemas.microsoft.com/office/word/2015/wordml/symex" xmlns:wpg="http://schemas.microsoft.com/office/word/2010/wordprocessingGroup" xmlns:wpi="http://schemas.microsoft.com/office/word/2010/wordprocessingInk" xmlns:wne="http://schemas.microsoft.com/office/word/2006/wordml" xmlns:wps="http://schemas.microsoft.com/office/word/2010/wordprocessingShape" mc:Ignorable="w14 w15 w16se w16cid w16 w16cex w16sdtdh w16sdtfl w16du wp14">
   <w:tbl>
     <w:tblPr>
       <w:tblStyle w:val="Tablaconcuadrcula"/>
@@ -7695,7 +7728,7 @@
 </file>
 
 <file path=word/numbering.xml><?xml version="1.0" encoding="utf-8"?>
-<w:numbering xmlns:wpc="http://schemas.microsoft.com/office/word/2010/wordprocessingCanvas" xmlns:cx="http://schemas.microsoft.com/office/drawing/2014/chartex" xmlns:cx1="http://schemas.microsoft.com/office/drawing/2015/9/8/chartex" xmlns:cx2="http://schemas.microsoft.com/office/drawing/2015/10/21/chartex" xmlns:cx3="http://schemas.microsoft.com/office/drawing/2016/5/9/chartex" xmlns:cx4="http://schemas.microsoft.com/office/drawing/2016/5/10/chartex" xmlns:cx5="http://schemas.microsoft.com/office/drawing/2016/5/11/chartex" xmlns:cx6="http://schemas.microsoft.com/office/drawing/2016/5/12/chartex" xmlns:cx7="http://schemas.microsoft.com/office/drawing/2016/5/13/chartex" xmlns:cx8="http://schemas.microsoft.com/office/drawing/2016/5/14/chartex" xmlns:mc="http://schemas.openxmlformats.org/markup-compatibility/2006" xmlns:aink="http://schemas.microsoft.com/office/drawing/2016/ink" xmlns:am3d="http://schemas.microsoft.com/office/drawing/2017/model3d" xmlns:o="urn:schemas-microsoft-com:office:office" xmlns:oel="http://schemas.microsoft.com/office/2019/extlst" xmlns:r="http://schemas.openxmlformats.org/officeDocument/2006/relationships" xmlns:m="http://schemas.openxmlformats.org/officeDocument/2006/math" xmlns:v="urn:schemas-microsoft-com:vml" xmlns:wp14="http://schemas.microsoft.com/office/word/2010/wordprocessingDrawing" xmlns:wp="http://schemas.openxmlformats.org/drawingml/2006/wordprocessingDrawing" xmlns:w10="urn:schemas-microsoft-com:office:word" xmlns:w="http://schemas.openxmlformats.org/wordprocessingml/2006/main" xmlns:w14="http://schemas.microsoft.com/office/word/2010/wordml" xmlns:w15="http://schemas.microsoft.com/office/word/2012/wordml" xmlns:w16cei="http://schemas.microsoft.com/office/word/2026/wordml/cei" xmlns:w16cex="http://schemas.microsoft.com/office/word/2018/wordml/cex" xmlns:w16cid="http://schemas.microsoft.com/office/word/2016/wordml/cid" xmlns:w16="http://schemas.microsoft.com/office/word/2018/wordml" xmlns:w16du="http://schemas.microsoft.com/office/word/2023/wordml/word16du" xmlns:w16sdtdh="http://schemas.microsoft.com/office/word/2020/wordml/sdtdatahash" xmlns:w16sdtfl="http://schemas.microsoft.com/office/word/2024/wordml/sdtformatlock" xmlns:w16se="http://schemas.microsoft.com/office/word/2015/wordml/symex" xmlns:wpg="http://schemas.microsoft.com/office/word/2010/wordprocessingGroup" xmlns:wpi="http://schemas.microsoft.com/office/word/2010/wordprocessingInk" xmlns:wne="http://schemas.microsoft.com/office/word/2006/wordml" xmlns:wps="http://schemas.microsoft.com/office/word/2010/wordprocessingShape" mc:Ignorable="w14 w15 w16se w16cid w16 w16cex w16sdtdh w16sdtfl w16du wp14">
+<w:numbering xmlns:wpc="http://schemas.microsoft.com/office/word/2010/wordprocessingCanvas" xmlns:cx="http://schemas.microsoft.com/office/drawing/2014/chartex" xmlns:cx1="http://schemas.microsoft.com/office/drawing/2015/9/8/chartex" xmlns:cx2="http://schemas.microsoft.com/office/drawing/2015/10/21/chartex" xmlns:cx3="http://schemas.microsoft.com/office/drawing/2016/5/9/chartex" xmlns:cx4="http://schemas.microsoft.com/office/drawing/2016/5/10/chartex" xmlns:cx5="http://schemas.microsoft.com/office/drawing/2016/5/11/chartex" xmlns:cx6="http://schemas.microsoft.com/office/drawing/2016/5/12/chartex" xmlns:cx7="http://schemas.microsoft.com/office/drawing/2016/5/13/chartex" xmlns:cx8="http://schemas.microsoft.com/office/drawing/2016/5/14/chartex" xmlns:mc="http://schemas.openxmlformats.org/markup-compatibility/2006" xmlns:aink="http://schemas.microsoft.com/office/drawing/2016/ink" xmlns:am3d="http://schemas.microsoft.com/office/drawing/2017/model3d" xmlns:o="urn:schemas-microsoft-com:office:office" xmlns:oel="http://schemas.microsoft.com/office/2019/extlst" xmlns:r="http://schemas.openxmlformats.org/officeDocument/2006/relationships" xmlns:m="http://schemas.openxmlformats.org/officeDocument/2006/math" xmlns:v="urn:schemas-microsoft-com:vml" xmlns:wp14="http://schemas.microsoft.com/office/word/2010/wordprocessingDrawing" xmlns:wp="http://schemas.openxmlformats.org/drawingml/2006/wordprocessingDrawing" xmlns:w10="urn:schemas-microsoft-com:office:word" xmlns:w="http://schemas.openxmlformats.org/wordprocessingml/2006/main" xmlns:w14="http://schemas.microsoft.com/office/word/2010/wordml" xmlns:w15="http://schemas.microsoft.com/office/word/2012/wordml" xmlns:w16cex="http://schemas.microsoft.com/office/word/2018/wordml/cex" xmlns:w16cid="http://schemas.microsoft.com/office/word/2016/wordml/cid" xmlns:w16="http://schemas.microsoft.com/office/word/2018/wordml" xmlns:w16du="http://schemas.microsoft.com/office/word/2023/wordml/word16du" xmlns:w16sdtdh="http://schemas.microsoft.com/office/word/2020/wordml/sdtdatahash" xmlns:w16sdtfl="http://schemas.microsoft.com/office/word/2024/wordml/sdtformatlock" xmlns:w16se="http://schemas.microsoft.com/office/word/2015/wordml/symex" xmlns:wpg="http://schemas.microsoft.com/office/word/2010/wordprocessingGroup" xmlns:wpi="http://schemas.microsoft.com/office/word/2010/wordprocessingInk" xmlns:wne="http://schemas.microsoft.com/office/word/2006/wordml" xmlns:wps="http://schemas.microsoft.com/office/word/2010/wordprocessingShape" mc:Ignorable="w14 w15 w16se w16cid w16 w16cex w16sdtdh w16sdtfl w16du wp14">
   <w:numPicBullet w:numPicBulletId="0">
     <w:pict>
       <v:shapetype id="_x0000_t75" coordsize="21600,21600" o:spt="75" o:preferrelative="t" path="m@4@5l@4@11@9@11@9@5xe" filled="f" stroked="f">
@@ -7717,7 +7750,7 @@
         <v:path o:extrusionok="f" gradientshapeok="t" o:connecttype="rect"/>
         <o:lock v:ext="edit" aspectratio="t"/>
       </v:shapetype>
-      <v:shape id="_x0000_i1025" type="#_x0000_t75" style="width:11.1pt;height:11.1pt;visibility:visible;mso-wrap-style:square" o:bullet="t">
+      <v:shape id="_x0000_i1025" type="#_x0000_t75" style="width:11.4pt;height:11.4pt;visibility:visible;mso-wrap-style:square" o:bullet="t">
         <v:imagedata r:id="rId1" o:title=""/>
       </v:shape>
     </w:pict>
@@ -12288,6 +12321,32 @@
 </file>
 
 <file path=customXml/item1.xml><?xml version="1.0" encoding="utf-8"?>
+<b:Sources xmlns:b="http://schemas.openxmlformats.org/officeDocument/2006/bibliography" xmlns="http://schemas.openxmlformats.org/officeDocument/2006/bibliography" SelectedStyle="\APASixthEditionOfficeOnline.xsl" StyleName="APA" Version="6"/>
+</file>
+
+<file path=customXml/item2.xml><?xml version="1.0" encoding="utf-8"?>
+<?mso-contentType ?>
+<FormTemplates xmlns="http://schemas.microsoft.com/sharepoint/v3/contenttype/forms">
+  <Display>DocumentLibraryForm</Display>
+  <Edit>DocumentLibraryForm</Edit>
+  <New>DocumentLibraryForm</New>
+</FormTemplates>
+</file>
+
+<file path=customXml/item3.xml><?xml version="1.0" encoding="utf-8"?>
+<p:properties xmlns:p="http://schemas.microsoft.com/office/2006/metadata/properties" xmlns:xsi="http://www.w3.org/2001/XMLSchema-instance" xmlns:pc="http://schemas.microsoft.com/office/infopath/2007/PartnerControls">
+  <documentManagement>
+    <lcf76f155ced4ddcb4097134ff3c332f xmlns="aa5afa56-7e35-446d-92fd-ff9896fa623a">
+      <Terms xmlns="http://schemas.microsoft.com/office/infopath/2007/PartnerControls"/>
+    </lcf76f155ced4ddcb4097134ff3c332f>
+    <TaxCatchAll xmlns="6fd75834-9ba6-41f9-b1c8-ae1f15b4a690" xsi:nil="true"/>
+    <_ip_UnifiedCompliancePolicyUIAction xmlns="http://schemas.microsoft.com/sharepoint/v3" xsi:nil="true"/>
+    <_ip_UnifiedCompliancePolicyProperties xmlns="http://schemas.microsoft.com/sharepoint/v3" xsi:nil="true"/>
+  </documentManagement>
+</p:properties>
+</file>
+
+<file path=customXml/item4.xml><?xml version="1.0" encoding="utf-8"?>
 <ct:contentTypeSchema xmlns:ct="http://schemas.microsoft.com/office/2006/metadata/contentType" xmlns:ma="http://schemas.microsoft.com/office/2006/metadata/properties/metaAttributes" ct:_="" ma:_="" ma:contentTypeName="Documento" ma:contentTypeID="0x010100A87C2EA155D72146AF5E83CE3CFFEB38" ma:contentTypeVersion="15" ma:contentTypeDescription="Crear nuevo documento." ma:contentTypeScope="" ma:versionID="18a8814fc859c49a9914bd993aa96308">
   <xsd:schema xmlns:xsd="http://www.w3.org/2001/XMLSchema" xmlns:xs="http://www.w3.org/2001/XMLSchema" xmlns:p="http://schemas.microsoft.com/office/2006/metadata/properties" xmlns:ns1="http://schemas.microsoft.com/sharepoint/v3" xmlns:ns2="aa5afa56-7e35-446d-92fd-ff9896fa623a" xmlns:ns3="6fd75834-9ba6-41f9-b1c8-ae1f15b4a690" targetNamespace="http://schemas.microsoft.com/office/2006/metadata/properties" ma:root="true" ma:fieldsID="b5ab34ea1fc8b639d8e6f399185c44ce" ns1:_="" ns2:_="" ns3:_="">
     <xsd:import namespace="http://schemas.microsoft.com/sharepoint/v3"/>
@@ -12511,33 +12570,35 @@
 </ct:contentTypeSchema>
 </file>
 
-<file path=customXml/item2.xml><?xml version="1.0" encoding="utf-8"?>
-<p:properties xmlns:p="http://schemas.microsoft.com/office/2006/metadata/properties" xmlns:xsi="http://www.w3.org/2001/XMLSchema-instance" xmlns:pc="http://schemas.microsoft.com/office/infopath/2007/PartnerControls">
-  <documentManagement>
-    <lcf76f155ced4ddcb4097134ff3c332f xmlns="aa5afa56-7e35-446d-92fd-ff9896fa623a">
-      <Terms xmlns="http://schemas.microsoft.com/office/infopath/2007/PartnerControls"/>
-    </lcf76f155ced4ddcb4097134ff3c332f>
-    <TaxCatchAll xmlns="6fd75834-9ba6-41f9-b1c8-ae1f15b4a690" xsi:nil="true"/>
-    <_ip_UnifiedCompliancePolicyUIAction xmlns="http://schemas.microsoft.com/sharepoint/v3" xsi:nil="true"/>
-    <_ip_UnifiedCompliancePolicyProperties xmlns="http://schemas.microsoft.com/sharepoint/v3" xsi:nil="true"/>
-  </documentManagement>
-</p:properties>
+<file path=customXml/itemProps1.xml><?xml version="1.0" encoding="utf-8"?>
+<ds:datastoreItem xmlns:ds="http://schemas.openxmlformats.org/officeDocument/2006/customXml" ds:itemID="{77A56A8C-BE70-4E70-99EC-2F618D543D72}">
+  <ds:schemaRefs>
+    <ds:schemaRef ds:uri="http://schemas.openxmlformats.org/officeDocument/2006/bibliography"/>
+  </ds:schemaRefs>
+</ds:datastoreItem>
 </file>
 
-<file path=customXml/item3.xml><?xml version="1.0" encoding="utf-8"?>
-<?mso-contentType ?>
-<FormTemplates xmlns="http://schemas.microsoft.com/sharepoint/v3/contenttype/forms">
-  <Display>DocumentLibraryForm</Display>
-  <Edit>DocumentLibraryForm</Edit>
-  <New>DocumentLibraryForm</New>
-</FormTemplates>
+<file path=customXml/itemProps2.xml><?xml version="1.0" encoding="utf-8"?>
+<ds:datastoreItem xmlns:ds="http://schemas.openxmlformats.org/officeDocument/2006/customXml" ds:itemID="{76BDF5B0-3289-48E8-B032-9EB95748DFC7}">
+  <ds:schemaRefs>
+    <ds:schemaRef ds:uri="http://schemas.microsoft.com/sharepoint/v3/contenttype/forms"/>
+  </ds:schemaRefs>
+</ds:datastoreItem>
 </file>
 
-<file path=customXml/item4.xml><?xml version="1.0" encoding="utf-8"?>
-<b:Sources xmlns:b="http://schemas.openxmlformats.org/officeDocument/2006/bibliography" xmlns="http://schemas.openxmlformats.org/officeDocument/2006/bibliography" SelectedStyle="\APASixthEditionOfficeOnline.xsl" StyleName="APA" Version="6"/>
+<file path=customXml/itemProps3.xml><?xml version="1.0" encoding="utf-8"?>
+<ds:datastoreItem xmlns:ds="http://schemas.openxmlformats.org/officeDocument/2006/customXml" ds:itemID="{922086B0-03AB-4365-AC3D-F2E49F66FC63}">
+  <ds:schemaRefs>
+    <ds:schemaRef ds:uri="http://schemas.microsoft.com/office/2006/metadata/properties"/>
+    <ds:schemaRef ds:uri="http://schemas.microsoft.com/office/infopath/2007/PartnerControls"/>
+    <ds:schemaRef ds:uri="aa5afa56-7e35-446d-92fd-ff9896fa623a"/>
+    <ds:schemaRef ds:uri="6fd75834-9ba6-41f9-b1c8-ae1f15b4a690"/>
+    <ds:schemaRef ds:uri="http://schemas.microsoft.com/sharepoint/v3"/>
+  </ds:schemaRefs>
+</ds:datastoreItem>
 </file>
 
-<file path=customXml/itemProps1.xml><?xml version="1.0" encoding="utf-8"?>
+<file path=customXml/itemProps4.xml><?xml version="1.0" encoding="utf-8"?>
 <ds:datastoreItem xmlns:ds="http://schemas.openxmlformats.org/officeDocument/2006/customXml" ds:itemID="{A820D5A8-4D01-4CC1-A72E-C93B01314DC4}">
   <ds:schemaRefs>
     <ds:schemaRef ds:uri="http://schemas.microsoft.com/office/2006/metadata/contentType"/>
@@ -12557,34 +12618,6 @@
 </ds:datastoreItem>
 </file>
 
-<file path=customXml/itemProps2.xml><?xml version="1.0" encoding="utf-8"?>
-<ds:datastoreItem xmlns:ds="http://schemas.openxmlformats.org/officeDocument/2006/customXml" ds:itemID="{922086B0-03AB-4365-AC3D-F2E49F66FC63}">
-  <ds:schemaRefs>
-    <ds:schemaRef ds:uri="http://schemas.microsoft.com/office/2006/metadata/properties"/>
-    <ds:schemaRef ds:uri="http://schemas.microsoft.com/office/infopath/2007/PartnerControls"/>
-    <ds:schemaRef ds:uri="aa5afa56-7e35-446d-92fd-ff9896fa623a"/>
-    <ds:schemaRef ds:uri="6fd75834-9ba6-41f9-b1c8-ae1f15b4a690"/>
-    <ds:schemaRef ds:uri="http://schemas.microsoft.com/sharepoint/v3"/>
-  </ds:schemaRefs>
-</ds:datastoreItem>
-</file>
-
-<file path=customXml/itemProps3.xml><?xml version="1.0" encoding="utf-8"?>
-<ds:datastoreItem xmlns:ds="http://schemas.openxmlformats.org/officeDocument/2006/customXml" ds:itemID="{76BDF5B0-3289-48E8-B032-9EB95748DFC7}">
-  <ds:schemaRefs>
-    <ds:schemaRef ds:uri="http://schemas.microsoft.com/sharepoint/v3/contenttype/forms"/>
-  </ds:schemaRefs>
-</ds:datastoreItem>
-</file>
-
-<file path=customXml/itemProps4.xml><?xml version="1.0" encoding="utf-8"?>
-<ds:datastoreItem xmlns:ds="http://schemas.openxmlformats.org/officeDocument/2006/customXml" ds:itemID="{77A56A8C-BE70-4E70-99EC-2F618D543D72}">
-  <ds:schemaRefs>
-    <ds:schemaRef ds:uri="http://schemas.openxmlformats.org/officeDocument/2006/bibliography"/>
-  </ds:schemaRefs>
-</ds:datastoreItem>
-</file>
-
 <file path=docMetadata/LabelInfo.xml><?xml version="1.0" encoding="utf-8"?>
 <clbl:labelList xmlns:clbl="http://schemas.microsoft.com/office/2020/mipLabelMetadata">
   <clbl:label id="{b7a85cbc-91d7-4bc3-bc7f-34262549961f}" enabled="1" method="Standard" siteId="{0fb730e1-89f1-4035-ae89-d327c0f1d87b}" contentBits="0" removed="0"/>

</xml_diff>